<commit_message>
adding new persons data + removing similarity score from results
</commit_message>
<xml_diff>
--- a/ethics-application/participant-information-leaflet.docx
+++ b/ethics-application/participant-information-leaflet.docx
@@ -846,7 +846,7 @@
           <w:iCs/>
           <w:u w:val="none"/>
         </w:rPr>
-        <w:t xml:space="preserve">The study should take no longer than 30 minutes, and it will take place in </w:t>
+        <w:t xml:space="preserve">The study should take no longer than 30 minutes, and it will take place in a private meeting in the School of Computer Science </w:t>
       </w:r>
       <w:r>
         <w:rPr>
@@ -854,7 +854,15 @@
           <w:iCs/>
           <w:u w:val="none"/>
         </w:rPr>
-        <w:t>a private meeting in the School of Computer Science, Trinity College Dublin.</w:t>
+        <w:t>and Statistics</w:t>
+      </w:r>
+      <w:r>
+        <w:rPr>
+          <w:i/>
+          <w:iCs/>
+          <w:u w:val="none"/>
+        </w:rPr>
+        <w:t>, Trinity College Dublin.</w:t>
       </w:r>
     </w:p>
     <w:p>
@@ -2665,9 +2673,9 @@
           <wp:wrapTight wrapText="bothSides">
             <wp:wrapPolygon edited="0">
               <wp:start x="-12" y="0"/>
-              <wp:lineTo x="-12" y="20820"/>
-              <wp:lineTo x="21447" y="20820"/>
-              <wp:lineTo x="21447" y="0"/>
+              <wp:lineTo x="-12" y="20783"/>
+              <wp:lineTo x="21435" y="20783"/>
+              <wp:lineTo x="21435" y="0"/>
               <wp:lineTo x="-12" y="0"/>
             </wp:wrapPolygon>
           </wp:wrapTight>
@@ -2733,9 +2741,9 @@
           <wp:wrapTight wrapText="bothSides">
             <wp:wrapPolygon edited="0">
               <wp:start x="-12" y="0"/>
-              <wp:lineTo x="-12" y="20820"/>
-              <wp:lineTo x="21447" y="20820"/>
-              <wp:lineTo x="21447" y="0"/>
+              <wp:lineTo x="-12" y="20783"/>
+              <wp:lineTo x="21435" y="20783"/>
+              <wp:lineTo x="21435" y="0"/>
               <wp:lineTo x="-12" y="0"/>
             </wp:wrapPolygon>
           </wp:wrapTight>

</xml_diff>